<commit_message>
docs: simplify screenshot labels — template names only, swap left/right to top/bottom
</commit_message>
<xml_diff>
--- a/_screenshots/academic_docx/output/academic_demo.docx
+++ b/_screenshots/academic_docx/output/academic_demo.docx
@@ -39,6 +39,7 @@
     <w:p>
       <w:pPr>
         <w:spacing w:line="300" w:lineRule="auto" w:after="0"/>
+        <w:ind w:firstLine="420"/>
       </w:pPr>
       <w:r>
         <w:rPr>
@@ -53,6 +54,7 @@
     <w:p>
       <w:pPr>
         <w:spacing w:line="300" w:lineRule="auto" w:after="0"/>
+        <w:ind w:firstLine="420"/>
       </w:pPr>
       <w:r>
         <w:rPr>
@@ -101,6 +103,7 @@
     <w:p>
       <w:pPr>
         <w:spacing w:line="300" w:lineRule="auto" w:after="0"/>
+        <w:ind w:firstLine="420"/>
       </w:pPr>
       <w:r>
         <w:rPr>
@@ -115,6 +118,7 @@
     <w:p>
       <w:pPr>
         <w:spacing w:line="300" w:lineRule="auto" w:after="0"/>
+        <w:ind w:firstLine="420"/>
       </w:pPr>
       <w:r>
         <w:rPr>
@@ -163,6 +167,7 @@
     <w:p>
       <w:pPr>
         <w:spacing w:line="300" w:lineRule="auto" w:after="0"/>
+        <w:ind w:firstLine="420"/>
       </w:pPr>
       <w:r>
         <w:rPr>
@@ -194,6 +199,7 @@
     <w:p>
       <w:pPr>
         <w:spacing w:line="300" w:lineRule="auto" w:after="0"/>
+        <w:ind w:firstLine="420"/>
       </w:pPr>
       <w:r>
         <w:rPr>
@@ -242,6 +248,7 @@
     <w:p>
       <w:pPr>
         <w:spacing w:line="300" w:lineRule="auto" w:after="0"/>
+        <w:ind w:firstLine="420"/>
       </w:pPr>
       <w:r>
         <w:rPr>
@@ -1142,6 +1149,7 @@
     <w:p>
       <w:pPr>
         <w:spacing w:line="300" w:lineRule="auto" w:after="0"/>
+        <w:ind w:firstLine="420"/>
       </w:pPr>
       <w:r>
         <w:rPr>
@@ -1156,6 +1164,7 @@
     <w:p>
       <w:pPr>
         <w:spacing w:line="300" w:lineRule="auto" w:after="0"/>
+        <w:ind w:firstLine="420"/>
       </w:pPr>
       <w:r>
         <w:rPr>
@@ -1170,6 +1179,7 @@
     <w:p>
       <w:pPr>
         <w:spacing w:line="300" w:lineRule="auto" w:after="0"/>
+        <w:ind w:firstLine="420"/>
       </w:pPr>
       <w:r>
         <w:rPr>
@@ -1184,6 +1194,7 @@
     <w:p>
       <w:pPr>
         <w:spacing w:line="300" w:lineRule="auto" w:after="0"/>
+        <w:ind w:firstLine="420"/>
       </w:pPr>
       <w:r>
         <w:rPr>
@@ -1198,6 +1209,7 @@
     <w:p>
       <w:pPr>
         <w:spacing w:line="300" w:lineRule="auto" w:after="0"/>
+        <w:ind w:firstLine="420"/>
       </w:pPr>
       <w:r>
         <w:rPr>

</xml_diff>